<commit_message>
Rename CY5 blockchain course
</commit_message>
<xml_diff>
--- a/docs/hit-catalogue/CY5/catalogue_summary.docx
+++ b/docs/hit-catalogue/CY5/catalogue_summary.docx
@@ -26,7 +26,7 @@
           <w:b/>
           <w:rtl/>
         </w:rPr>
-        <w:t>בלוקצ'יין חזון ופרקטיקה - 67007</w:t>
+        <w:t>בלוקצ'יין ומערכות קריפטוגרפיות מבוזרות - 67007</w:t>
       </w:r>
     </w:p>
     <w:p>
@@ -37,7 +37,7 @@
         <w:rPr>
           <w:b w:val="0"/>
         </w:rPr>
-        <w:t>Blockchain &amp; Decentralized Systems</w:t>
+        <w:t>Blockchain and Decentralized Cryptographic Systems</w:t>
       </w:r>
     </w:p>
     <w:p>
@@ -126,7 +126,7 @@
         <w:rPr>
           <w:b/>
         </w:rPr>
-        <w:t>Blockchain &amp; Decentralized Systems</w:t>
+        <w:t>Blockchain and Decentralized Cryptographic Systems</w:t>
       </w:r>
     </w:p>
     <w:p>

</xml_diff>